<commit_message>
paper_v2: robustness checks R1-R6 complete (automatic overnight build)
Co-Authored-By: Claude Opus 5.5 <noreply@anthropic.com>
</commit_message>
<xml_diff>
--- a/paper/paper_v2.docx
+++ b/paper/paper_v2.docx
@@ -7132,7 +7132,7 @@
         <w:t xml:space="preserve"> </w:t>
       </w:r>
       <w:r>
-        <w:t xml:space="preserve">1.137 [1.126, 1.149], vivid colour 0.988 [0.984, 0.992].</w:t>
+        <w:t xml:space="preserve">1.137 [1.126, 1.149], vivid colour 0.988 [0.984, 0.992]. Restricting to 2019 posts (R2) gives aesthetic 1.050 [1.047, 1.052] and person 1.205 [1.195, 1.216]. Removing extreme observations (R6) gives aesthetic 1.057 [1.055, 1.060] and person 1.240 [1.231, 1.250]. With comments as the outcome (R3) gives aesthetic 1.042 [1.038, 1.047] and person 1.533 [1.507, 1.559]. In the full Mundlak model (R5), the within-account associations are person 1.144 [1.132, 1.156] and vivid colour 0.990 [0.986, 0.994].</w:t>
       </w:r>
     </w:p>
     <w:p>
@@ -7146,7 +7146,8 @@
     <w:tbl>
       <w:tblPr>
         <w:tblStyle w:val="Table"/>
-        <w:tblW w:type="auto" w:w="0"/>
+        <w:tblW w:type="pct" w:w="5000"/>
+        <w:tblLayout w:type="fixed"/>
         <w:tblLook w:firstRow="1" w:lastRow="0" w:firstColumn="0" w:lastColumn="0" w:noHBand="0" w:noVBand="0" w:val="0020"/>
         <w:tblCaption w:val="Table 5. Focal estimates across robustness specifications (exploratory)."/>
       </w:tblPr>
@@ -7270,29 +7271,29 @@
               <w:pStyle w:val="CSIRText"/>
             </w:pPr>
             <w:r>
-              <w:t xml:space="preserve">R4 ≥ 2 posts</w:t>
-            </w:r>
-          </w:p>
-        </w:tc>
-        <w:tc>
-          <w:tcPr/>
-          <w:p>
-            <w:pPr>
-              <w:pStyle w:val="CSIRText"/>
-            </w:pPr>
-            <w:r>
-              <w:t xml:space="preserve">1.137</w:t>
-            </w:r>
-          </w:p>
-        </w:tc>
-        <w:tc>
-          <w:tcPr/>
-          <w:p>
-            <w:pPr>
-              <w:pStyle w:val="CSIRText"/>
-            </w:pPr>
-            <w:r>
-              <w:t xml:space="preserve">[1.126, 1.149]</w:t>
+              <w:t xml:space="preserve">R1 followers free</w:t>
+            </w:r>
+          </w:p>
+        </w:tc>
+        <w:tc>
+          <w:tcPr/>
+          <w:p>
+            <w:pPr>
+              <w:pStyle w:val="CSIRText"/>
+            </w:pPr>
+            <w:r>
+              <w:t xml:space="preserve">1.362</w:t>
+            </w:r>
+          </w:p>
+        </w:tc>
+        <w:tc>
+          <w:tcPr/>
+          <w:p>
+            <w:pPr>
+              <w:pStyle w:val="CSIRText"/>
+            </w:pPr>
+            <w:r>
+              <w:t xml:space="preserve">[1.352, 1.371]</w:t>
             </w:r>
           </w:p>
         </w:tc>
@@ -7305,40 +7306,40 @@
               <w:pStyle w:val="CSIRText"/>
             </w:pPr>
             <w:r>
-              <w:t xml:space="preserve">Aesthetic (H1)</w:t>
-            </w:r>
-          </w:p>
-        </w:tc>
-        <w:tc>
-          <w:tcPr/>
-          <w:p>
-            <w:pPr>
-              <w:pStyle w:val="CSIRText"/>
-            </w:pPr>
-            <w:r>
-              <w:t xml:space="preserve">Main</w:t>
-            </w:r>
-          </w:p>
-        </w:tc>
-        <w:tc>
-          <w:tcPr/>
-          <w:p>
-            <w:pPr>
-              <w:pStyle w:val="CSIRText"/>
-            </w:pPr>
-            <w:r>
-              <w:t xml:space="preserve">1.057</w:t>
-            </w:r>
-          </w:p>
-        </w:tc>
-        <w:tc>
-          <w:tcPr/>
-          <w:p>
-            <w:pPr>
-              <w:pStyle w:val="CSIRText"/>
-            </w:pPr>
-            <w:r>
-              <w:t xml:space="preserve">[1.055, 1.059]</w:t>
+              <w:t xml:space="preserve">Person (H2)</w:t>
+            </w:r>
+          </w:p>
+        </w:tc>
+        <w:tc>
+          <w:tcPr/>
+          <w:p>
+            <w:pPr>
+              <w:pStyle w:val="CSIRText"/>
+            </w:pPr>
+            <w:r>
+              <w:t xml:space="preserve">R2 2019 only</w:t>
+            </w:r>
+          </w:p>
+        </w:tc>
+        <w:tc>
+          <w:tcPr/>
+          <w:p>
+            <w:pPr>
+              <w:pStyle w:val="CSIRText"/>
+            </w:pPr>
+            <w:r>
+              <w:t xml:space="preserve">1.205</w:t>
+            </w:r>
+          </w:p>
+        </w:tc>
+        <w:tc>
+          <w:tcPr/>
+          <w:p>
+            <w:pPr>
+              <w:pStyle w:val="CSIRText"/>
+            </w:pPr>
+            <w:r>
+              <w:t xml:space="preserve">[1.195, 1.216]</w:t>
             </w:r>
           </w:p>
         </w:tc>
@@ -7351,40 +7352,40 @@
               <w:pStyle w:val="CSIRText"/>
             </w:pPr>
             <w:r>
-              <w:t xml:space="preserve">Aesthetic (H1)</w:t>
-            </w:r>
-          </w:p>
-        </w:tc>
-        <w:tc>
-          <w:tcPr/>
-          <w:p>
-            <w:pPr>
-              <w:pStyle w:val="CSIRText"/>
-            </w:pPr>
-            <w:r>
-              <w:t xml:space="preserve">R1 followers free</w:t>
-            </w:r>
-          </w:p>
-        </w:tc>
-        <w:tc>
-          <w:tcPr/>
-          <w:p>
-            <w:pPr>
-              <w:pStyle w:val="CSIRText"/>
-            </w:pPr>
-            <w:r>
-              <w:t xml:space="preserve">1.086</w:t>
-            </w:r>
-          </w:p>
-        </w:tc>
-        <w:tc>
-          <w:tcPr/>
-          <w:p>
-            <w:pPr>
-              <w:pStyle w:val="CSIRText"/>
-            </w:pPr>
-            <w:r>
-              <w:t xml:space="preserve">[1.084, 1.088]</w:t>
+              <w:t xml:space="preserve">Person (H2)</w:t>
+            </w:r>
+          </w:p>
+        </w:tc>
+        <w:tc>
+          <w:tcPr/>
+          <w:p>
+            <w:pPr>
+              <w:pStyle w:val="CSIRText"/>
+            </w:pPr>
+            <w:r>
+              <w:t xml:space="preserve">R3 comments</w:t>
+            </w:r>
+          </w:p>
+        </w:tc>
+        <w:tc>
+          <w:tcPr/>
+          <w:p>
+            <w:pPr>
+              <w:pStyle w:val="CSIRText"/>
+            </w:pPr>
+            <w:r>
+              <w:t xml:space="preserve">1.533</w:t>
+            </w:r>
+          </w:p>
+        </w:tc>
+        <w:tc>
+          <w:tcPr/>
+          <w:p>
+            <w:pPr>
+              <w:pStyle w:val="CSIRText"/>
+            </w:pPr>
+            <w:r>
+              <w:t xml:space="preserve">[1.507, 1.559]</w:t>
             </w:r>
           </w:p>
         </w:tc>
@@ -7397,7 +7398,7 @@
               <w:pStyle w:val="CSIRText"/>
             </w:pPr>
             <w:r>
-              <w:t xml:space="preserve">Aesthetic (H1)</w:t>
+              <w:t xml:space="preserve">Person (H2)</w:t>
             </w:r>
           </w:p>
         </w:tc>
@@ -7419,18 +7420,18 @@
               <w:pStyle w:val="CSIRText"/>
             </w:pPr>
             <w:r>
-              <w:t xml:space="preserve">1.046</w:t>
-            </w:r>
-          </w:p>
-        </w:tc>
-        <w:tc>
-          <w:tcPr/>
-          <w:p>
-            <w:pPr>
-              <w:pStyle w:val="CSIRText"/>
-            </w:pPr>
-            <w:r>
-              <w:t xml:space="preserve">[1.043, 1.049]</w:t>
+              <w:t xml:space="preserve">1.137</w:t>
+            </w:r>
+          </w:p>
+        </w:tc>
+        <w:tc>
+          <w:tcPr/>
+          <w:p>
+            <w:pPr>
+              <w:pStyle w:val="CSIRText"/>
+            </w:pPr>
+            <w:r>
+              <w:t xml:space="preserve">[1.126, 1.149]</w:t>
             </w:r>
           </w:p>
         </w:tc>
@@ -7443,40 +7444,40 @@
               <w:pStyle w:val="CSIRText"/>
             </w:pPr>
             <w:r>
-              <w:t xml:space="preserve">Vivid colour (H3)</w:t>
-            </w:r>
-          </w:p>
-        </w:tc>
-        <w:tc>
-          <w:tcPr/>
-          <w:p>
-            <w:pPr>
-              <w:pStyle w:val="CSIRText"/>
-            </w:pPr>
-            <w:r>
-              <w:t xml:space="preserve">Main</w:t>
-            </w:r>
-          </w:p>
-        </w:tc>
-        <w:tc>
-          <w:tcPr/>
-          <w:p>
-            <w:pPr>
-              <w:pStyle w:val="CSIRText"/>
-            </w:pPr>
-            <w:r>
-              <w:t xml:space="preserve">0.977</w:t>
-            </w:r>
-          </w:p>
-        </w:tc>
-        <w:tc>
-          <w:tcPr/>
-          <w:p>
-            <w:pPr>
-              <w:pStyle w:val="CSIRText"/>
-            </w:pPr>
-            <w:r>
-              <w:t xml:space="preserve">[0.974, 0.980]</w:t>
+              <w:t xml:space="preserve">Person (H2)</w:t>
+            </w:r>
+          </w:p>
+        </w:tc>
+        <w:tc>
+          <w:tcPr/>
+          <w:p>
+            <w:pPr>
+              <w:pStyle w:val="CSIRText"/>
+            </w:pPr>
+            <w:r>
+              <w:t xml:space="preserve">R5 full Mundlak (within)</w:t>
+            </w:r>
+          </w:p>
+        </w:tc>
+        <w:tc>
+          <w:tcPr/>
+          <w:p>
+            <w:pPr>
+              <w:pStyle w:val="CSIRText"/>
+            </w:pPr>
+            <w:r>
+              <w:t xml:space="preserve">1.144</w:t>
+            </w:r>
+          </w:p>
+        </w:tc>
+        <w:tc>
+          <w:tcPr/>
+          <w:p>
+            <w:pPr>
+              <w:pStyle w:val="CSIRText"/>
+            </w:pPr>
+            <w:r>
+              <w:t xml:space="preserve">[1.132, 1.156]</w:t>
             </w:r>
           </w:p>
         </w:tc>
@@ -7489,6 +7490,328 @@
               <w:pStyle w:val="CSIRText"/>
             </w:pPr>
             <w:r>
+              <w:t xml:space="preserve">Person (H2)</w:t>
+            </w:r>
+          </w:p>
+        </w:tc>
+        <w:tc>
+          <w:tcPr/>
+          <w:p>
+            <w:pPr>
+              <w:pStyle w:val="CSIRText"/>
+            </w:pPr>
+            <w:r>
+              <w:t xml:space="preserve">R6 extremes removed</w:t>
+            </w:r>
+          </w:p>
+        </w:tc>
+        <w:tc>
+          <w:tcPr/>
+          <w:p>
+            <w:pPr>
+              <w:pStyle w:val="CSIRText"/>
+            </w:pPr>
+            <w:r>
+              <w:t xml:space="preserve">1.240</w:t>
+            </w:r>
+          </w:p>
+        </w:tc>
+        <w:tc>
+          <w:tcPr/>
+          <w:p>
+            <w:pPr>
+              <w:pStyle w:val="CSIRText"/>
+            </w:pPr>
+            <w:r>
+              <w:t xml:space="preserve">[1.231, 1.250]</w:t>
+            </w:r>
+          </w:p>
+        </w:tc>
+      </w:tr>
+      <w:tr>
+        <w:tc>
+          <w:tcPr/>
+          <w:p>
+            <w:pPr>
+              <w:pStyle w:val="CSIRText"/>
+            </w:pPr>
+            <w:r>
+              <w:t xml:space="preserve">Aesthetic (H1)</w:t>
+            </w:r>
+          </w:p>
+        </w:tc>
+        <w:tc>
+          <w:tcPr/>
+          <w:p>
+            <w:pPr>
+              <w:pStyle w:val="CSIRText"/>
+            </w:pPr>
+            <w:r>
+              <w:t xml:space="preserve">Main</w:t>
+            </w:r>
+          </w:p>
+        </w:tc>
+        <w:tc>
+          <w:tcPr/>
+          <w:p>
+            <w:pPr>
+              <w:pStyle w:val="CSIRText"/>
+            </w:pPr>
+            <w:r>
+              <w:t xml:space="preserve">1.057</w:t>
+            </w:r>
+          </w:p>
+        </w:tc>
+        <w:tc>
+          <w:tcPr/>
+          <w:p>
+            <w:pPr>
+              <w:pStyle w:val="CSIRText"/>
+            </w:pPr>
+            <w:r>
+              <w:t xml:space="preserve">[1.055, 1.059]</w:t>
+            </w:r>
+          </w:p>
+        </w:tc>
+      </w:tr>
+      <w:tr>
+        <w:tc>
+          <w:tcPr/>
+          <w:p>
+            <w:pPr>
+              <w:pStyle w:val="CSIRText"/>
+            </w:pPr>
+            <w:r>
+              <w:t xml:space="preserve">Aesthetic (H1)</w:t>
+            </w:r>
+          </w:p>
+        </w:tc>
+        <w:tc>
+          <w:tcPr/>
+          <w:p>
+            <w:pPr>
+              <w:pStyle w:val="CSIRText"/>
+            </w:pPr>
+            <w:r>
+              <w:t xml:space="preserve">R1 followers free</w:t>
+            </w:r>
+          </w:p>
+        </w:tc>
+        <w:tc>
+          <w:tcPr/>
+          <w:p>
+            <w:pPr>
+              <w:pStyle w:val="CSIRText"/>
+            </w:pPr>
+            <w:r>
+              <w:t xml:space="preserve">1.086</w:t>
+            </w:r>
+          </w:p>
+        </w:tc>
+        <w:tc>
+          <w:tcPr/>
+          <w:p>
+            <w:pPr>
+              <w:pStyle w:val="CSIRText"/>
+            </w:pPr>
+            <w:r>
+              <w:t xml:space="preserve">[1.084, 1.088]</w:t>
+            </w:r>
+          </w:p>
+        </w:tc>
+      </w:tr>
+      <w:tr>
+        <w:tc>
+          <w:tcPr/>
+          <w:p>
+            <w:pPr>
+              <w:pStyle w:val="CSIRText"/>
+            </w:pPr>
+            <w:r>
+              <w:t xml:space="preserve">Aesthetic (H1)</w:t>
+            </w:r>
+          </w:p>
+        </w:tc>
+        <w:tc>
+          <w:tcPr/>
+          <w:p>
+            <w:pPr>
+              <w:pStyle w:val="CSIRText"/>
+            </w:pPr>
+            <w:r>
+              <w:t xml:space="preserve">R2 2019 only</w:t>
+            </w:r>
+          </w:p>
+        </w:tc>
+        <w:tc>
+          <w:tcPr/>
+          <w:p>
+            <w:pPr>
+              <w:pStyle w:val="CSIRText"/>
+            </w:pPr>
+            <w:r>
+              <w:t xml:space="preserve">1.050</w:t>
+            </w:r>
+          </w:p>
+        </w:tc>
+        <w:tc>
+          <w:tcPr/>
+          <w:p>
+            <w:pPr>
+              <w:pStyle w:val="CSIRText"/>
+            </w:pPr>
+            <w:r>
+              <w:t xml:space="preserve">[1.047, 1.052]</w:t>
+            </w:r>
+          </w:p>
+        </w:tc>
+      </w:tr>
+      <w:tr>
+        <w:tc>
+          <w:tcPr/>
+          <w:p>
+            <w:pPr>
+              <w:pStyle w:val="CSIRText"/>
+            </w:pPr>
+            <w:r>
+              <w:t xml:space="preserve">Aesthetic (H1)</w:t>
+            </w:r>
+          </w:p>
+        </w:tc>
+        <w:tc>
+          <w:tcPr/>
+          <w:p>
+            <w:pPr>
+              <w:pStyle w:val="CSIRText"/>
+            </w:pPr>
+            <w:r>
+              <w:t xml:space="preserve">R3 comments</w:t>
+            </w:r>
+          </w:p>
+        </w:tc>
+        <w:tc>
+          <w:tcPr/>
+          <w:p>
+            <w:pPr>
+              <w:pStyle w:val="CSIRText"/>
+            </w:pPr>
+            <w:r>
+              <w:t xml:space="preserve">1.042</w:t>
+            </w:r>
+          </w:p>
+        </w:tc>
+        <w:tc>
+          <w:tcPr/>
+          <w:p>
+            <w:pPr>
+              <w:pStyle w:val="CSIRText"/>
+            </w:pPr>
+            <w:r>
+              <w:t xml:space="preserve">[1.038, 1.047]</w:t>
+            </w:r>
+          </w:p>
+        </w:tc>
+      </w:tr>
+      <w:tr>
+        <w:tc>
+          <w:tcPr/>
+          <w:p>
+            <w:pPr>
+              <w:pStyle w:val="CSIRText"/>
+            </w:pPr>
+            <w:r>
+              <w:t xml:space="preserve">Aesthetic (H1)</w:t>
+            </w:r>
+          </w:p>
+        </w:tc>
+        <w:tc>
+          <w:tcPr/>
+          <w:p>
+            <w:pPr>
+              <w:pStyle w:val="CSIRText"/>
+            </w:pPr>
+            <w:r>
+              <w:t xml:space="preserve">R4 ≥ 2 posts</w:t>
+            </w:r>
+          </w:p>
+        </w:tc>
+        <w:tc>
+          <w:tcPr/>
+          <w:p>
+            <w:pPr>
+              <w:pStyle w:val="CSIRText"/>
+            </w:pPr>
+            <w:r>
+              <w:t xml:space="preserve">1.046</w:t>
+            </w:r>
+          </w:p>
+        </w:tc>
+        <w:tc>
+          <w:tcPr/>
+          <w:p>
+            <w:pPr>
+              <w:pStyle w:val="CSIRText"/>
+            </w:pPr>
+            <w:r>
+              <w:t xml:space="preserve">[1.043, 1.049]</w:t>
+            </w:r>
+          </w:p>
+        </w:tc>
+      </w:tr>
+      <w:tr>
+        <w:tc>
+          <w:tcPr/>
+          <w:p>
+            <w:pPr>
+              <w:pStyle w:val="CSIRText"/>
+            </w:pPr>
+            <w:r>
+              <w:t xml:space="preserve">Aesthetic (H1)</w:t>
+            </w:r>
+          </w:p>
+        </w:tc>
+        <w:tc>
+          <w:tcPr/>
+          <w:p>
+            <w:pPr>
+              <w:pStyle w:val="CSIRText"/>
+            </w:pPr>
+            <w:r>
+              <w:t xml:space="preserve">R6 extremes removed</w:t>
+            </w:r>
+          </w:p>
+        </w:tc>
+        <w:tc>
+          <w:tcPr/>
+          <w:p>
+            <w:pPr>
+              <w:pStyle w:val="CSIRText"/>
+            </w:pPr>
+            <w:r>
+              <w:t xml:space="preserve">1.057</w:t>
+            </w:r>
+          </w:p>
+        </w:tc>
+        <w:tc>
+          <w:tcPr/>
+          <w:p>
+            <w:pPr>
+              <w:pStyle w:val="CSIRText"/>
+            </w:pPr>
+            <w:r>
+              <w:t xml:space="preserve">[1.055, 1.060]</w:t>
+            </w:r>
+          </w:p>
+        </w:tc>
+      </w:tr>
+      <w:tr>
+        <w:tc>
+          <w:tcPr/>
+          <w:p>
+            <w:pPr>
+              <w:pStyle w:val="CSIRText"/>
+            </w:pPr>
+            <w:r>
               <w:t xml:space="preserve">Vivid colour (H3)</w:t>
             </w:r>
           </w:p>
@@ -7500,6 +7823,190 @@
               <w:pStyle w:val="CSIRText"/>
             </w:pPr>
             <w:r>
+              <w:t xml:space="preserve">Main</w:t>
+            </w:r>
+          </w:p>
+        </w:tc>
+        <w:tc>
+          <w:tcPr/>
+          <w:p>
+            <w:pPr>
+              <w:pStyle w:val="CSIRText"/>
+            </w:pPr>
+            <w:r>
+              <w:t xml:space="preserve">0.977</w:t>
+            </w:r>
+          </w:p>
+        </w:tc>
+        <w:tc>
+          <w:tcPr/>
+          <w:p>
+            <w:pPr>
+              <w:pStyle w:val="CSIRText"/>
+            </w:pPr>
+            <w:r>
+              <w:t xml:space="preserve">[0.974, 0.980]</w:t>
+            </w:r>
+          </w:p>
+        </w:tc>
+      </w:tr>
+      <w:tr>
+        <w:tc>
+          <w:tcPr/>
+          <w:p>
+            <w:pPr>
+              <w:pStyle w:val="CSIRText"/>
+            </w:pPr>
+            <w:r>
+              <w:t xml:space="preserve">Vivid colour (H3)</w:t>
+            </w:r>
+          </w:p>
+        </w:tc>
+        <w:tc>
+          <w:tcPr/>
+          <w:p>
+            <w:pPr>
+              <w:pStyle w:val="CSIRText"/>
+            </w:pPr>
+            <w:r>
+              <w:t xml:space="preserve">R1 followers free</w:t>
+            </w:r>
+          </w:p>
+        </w:tc>
+        <w:tc>
+          <w:tcPr/>
+          <w:p>
+            <w:pPr>
+              <w:pStyle w:val="CSIRText"/>
+            </w:pPr>
+            <w:r>
+              <w:t xml:space="preserve">0.985</w:t>
+            </w:r>
+          </w:p>
+        </w:tc>
+        <w:tc>
+          <w:tcPr/>
+          <w:p>
+            <w:pPr>
+              <w:pStyle w:val="CSIRText"/>
+            </w:pPr>
+            <w:r>
+              <w:t xml:space="preserve">[0.982, 0.988]</w:t>
+            </w:r>
+          </w:p>
+        </w:tc>
+      </w:tr>
+      <w:tr>
+        <w:tc>
+          <w:tcPr/>
+          <w:p>
+            <w:pPr>
+              <w:pStyle w:val="CSIRText"/>
+            </w:pPr>
+            <w:r>
+              <w:t xml:space="preserve">Vivid colour (H3)</w:t>
+            </w:r>
+          </w:p>
+        </w:tc>
+        <w:tc>
+          <w:tcPr/>
+          <w:p>
+            <w:pPr>
+              <w:pStyle w:val="CSIRText"/>
+            </w:pPr>
+            <w:r>
+              <w:t xml:space="preserve">R2 2019 only</w:t>
+            </w:r>
+          </w:p>
+        </w:tc>
+        <w:tc>
+          <w:tcPr/>
+          <w:p>
+            <w:pPr>
+              <w:pStyle w:val="CSIRText"/>
+            </w:pPr>
+            <w:r>
+              <w:t xml:space="preserve">0.975</w:t>
+            </w:r>
+          </w:p>
+        </w:tc>
+        <w:tc>
+          <w:tcPr/>
+          <w:p>
+            <w:pPr>
+              <w:pStyle w:val="CSIRText"/>
+            </w:pPr>
+            <w:r>
+              <w:t xml:space="preserve">[0.972, 0.978]</w:t>
+            </w:r>
+          </w:p>
+        </w:tc>
+      </w:tr>
+      <w:tr>
+        <w:tc>
+          <w:tcPr/>
+          <w:p>
+            <w:pPr>
+              <w:pStyle w:val="CSIRText"/>
+            </w:pPr>
+            <w:r>
+              <w:t xml:space="preserve">Vivid colour (H3)</w:t>
+            </w:r>
+          </w:p>
+        </w:tc>
+        <w:tc>
+          <w:tcPr/>
+          <w:p>
+            <w:pPr>
+              <w:pStyle w:val="CSIRText"/>
+            </w:pPr>
+            <w:r>
+              <w:t xml:space="preserve">R3 comments</w:t>
+            </w:r>
+          </w:p>
+        </w:tc>
+        <w:tc>
+          <w:tcPr/>
+          <w:p>
+            <w:pPr>
+              <w:pStyle w:val="CSIRText"/>
+            </w:pPr>
+            <w:r>
+              <w:t xml:space="preserve">0.975</w:t>
+            </w:r>
+          </w:p>
+        </w:tc>
+        <w:tc>
+          <w:tcPr/>
+          <w:p>
+            <w:pPr>
+              <w:pStyle w:val="CSIRText"/>
+            </w:pPr>
+            <w:r>
+              <w:t xml:space="preserve">[0.968, 0.982]</w:t>
+            </w:r>
+          </w:p>
+        </w:tc>
+      </w:tr>
+      <w:tr>
+        <w:tc>
+          <w:tcPr/>
+          <w:p>
+            <w:pPr>
+              <w:pStyle w:val="CSIRText"/>
+            </w:pPr>
+            <w:r>
+              <w:t xml:space="preserve">Vivid colour (H3)</w:t>
+            </w:r>
+          </w:p>
+        </w:tc>
+        <w:tc>
+          <w:tcPr/>
+          <w:p>
+            <w:pPr>
+              <w:pStyle w:val="CSIRText"/>
+            </w:pPr>
+            <w:r>
               <w:t xml:space="preserve">R4 ≥ 2 posts</w:t>
             </w:r>
           </w:p>
@@ -7523,6 +8030,98 @@
             </w:pPr>
             <w:r>
               <w:t xml:space="preserve">[0.984, 0.992]</w:t>
+            </w:r>
+          </w:p>
+        </w:tc>
+      </w:tr>
+      <w:tr>
+        <w:tc>
+          <w:tcPr/>
+          <w:p>
+            <w:pPr>
+              <w:pStyle w:val="CSIRText"/>
+            </w:pPr>
+            <w:r>
+              <w:t xml:space="preserve">Vivid colour (H3)</w:t>
+            </w:r>
+          </w:p>
+        </w:tc>
+        <w:tc>
+          <w:tcPr/>
+          <w:p>
+            <w:pPr>
+              <w:pStyle w:val="CSIRText"/>
+            </w:pPr>
+            <w:r>
+              <w:t xml:space="preserve">R5 full Mundlak (within)</w:t>
+            </w:r>
+          </w:p>
+        </w:tc>
+        <w:tc>
+          <w:tcPr/>
+          <w:p>
+            <w:pPr>
+              <w:pStyle w:val="CSIRText"/>
+            </w:pPr>
+            <w:r>
+              <w:t xml:space="preserve">0.990</w:t>
+            </w:r>
+          </w:p>
+        </w:tc>
+        <w:tc>
+          <w:tcPr/>
+          <w:p>
+            <w:pPr>
+              <w:pStyle w:val="CSIRText"/>
+            </w:pPr>
+            <w:r>
+              <w:t xml:space="preserve">[0.986, 0.994]</w:t>
+            </w:r>
+          </w:p>
+        </w:tc>
+      </w:tr>
+      <w:tr>
+        <w:tc>
+          <w:tcPr/>
+          <w:p>
+            <w:pPr>
+              <w:pStyle w:val="CSIRText"/>
+            </w:pPr>
+            <w:r>
+              <w:t xml:space="preserve">Vivid colour (H3)</w:t>
+            </w:r>
+          </w:p>
+        </w:tc>
+        <w:tc>
+          <w:tcPr/>
+          <w:p>
+            <w:pPr>
+              <w:pStyle w:val="CSIRText"/>
+            </w:pPr>
+            <w:r>
+              <w:t xml:space="preserve">R6 extremes removed</w:t>
+            </w:r>
+          </w:p>
+        </w:tc>
+        <w:tc>
+          <w:tcPr/>
+          <w:p>
+            <w:pPr>
+              <w:pStyle w:val="CSIRText"/>
+            </w:pPr>
+            <w:r>
+              <w:t xml:space="preserve">0.977</w:t>
+            </w:r>
+          </w:p>
+        </w:tc>
+        <w:tc>
+          <w:tcPr/>
+          <w:p>
+            <w:pPr>
+              <w:pStyle w:val="CSIRText"/>
+            </w:pPr>
+            <w:r>
+              <w:t xml:space="preserve">[0.974, 0.980]</w:t>
             </w:r>
           </w:p>
         </w:tc>
@@ -7598,7 +8197,7 @@
         <w:pStyle w:val="CSIRText"/>
       </w:pPr>
       <w:r>
-        <w:t xml:space="preserve">All 14 fitted models converged with positive-definite Hessians; M1 reported a false-convergence warning from nlminb; re-optimisation from its own estimates with an independent optimiser (BFGS) converged to the same optimum (identical log-likelihood and coefficients; D20). The NB2 dispersion and the account SD are similar across models</w:t>
+        <w:t xml:space="preserve">All 22 fitted models converged with positive-definite Hessians; M1 reported a false-convergence warning from nlminb; re-optimisation from its own estimates with an independent optimiser (BFGS) converged to the same optimum (identical log-likelihood and coefficients; D20). The NB2 dispersion and the account SD are similar across models</w:t>
       </w:r>
       <w:r>
         <w:t xml:space="preserve"> </w:t>
@@ -9151,51 +9750,51 @@
               <w:pStyle w:val="CSIRText"/>
             </w:pPr>
             <w:r>
-              <w:t xml:space="preserve">R4_M1</w:t>
-            </w:r>
-          </w:p>
-        </w:tc>
-        <w:tc>
-          <w:tcPr/>
-          <w:p>
-            <w:pPr>
-              <w:pStyle w:val="CSIRText"/>
-            </w:pPr>
-            <w:r>
-              <w:t xml:space="preserve">164,772</w:t>
-            </w:r>
-          </w:p>
-        </w:tc>
-        <w:tc>
-          <w:tcPr/>
-          <w:p>
-            <w:pPr>
-              <w:pStyle w:val="CSIRText"/>
-            </w:pPr>
-            <w:r>
-              <w:t xml:space="preserve">50,272</w:t>
-            </w:r>
-          </w:p>
-        </w:tc>
-        <w:tc>
-          <w:tcPr/>
-          <w:p>
-            <w:pPr>
-              <w:pStyle w:val="CSIRText"/>
-            </w:pPr>
-            <w:r>
-              <w:t xml:space="preserve">6.513</w:t>
-            </w:r>
-          </w:p>
-        </w:tc>
-        <w:tc>
-          <w:tcPr/>
-          <w:p>
-            <w:pPr>
-              <w:pStyle w:val="CSIRText"/>
-            </w:pPr>
-            <w:r>
-              <w:t xml:space="preserve">1.015</w:t>
+              <w:t xml:space="preserve">R1_M2</w:t>
+            </w:r>
+          </w:p>
+        </w:tc>
+        <w:tc>
+          <w:tcPr/>
+          <w:p>
+            <w:pPr>
+              <w:pStyle w:val="CSIRText"/>
+            </w:pPr>
+            <w:r>
+              <w:t xml:space="preserve">583,830</w:t>
+            </w:r>
+          </w:p>
+        </w:tc>
+        <w:tc>
+          <w:tcPr/>
+          <w:p>
+            <w:pPr>
+              <w:pStyle w:val="CSIRText"/>
+            </w:pPr>
+            <w:r>
+              <w:t xml:space="preserve">469,330</w:t>
+            </w:r>
+          </w:p>
+        </w:tc>
+        <w:tc>
+          <w:tcPr/>
+          <w:p>
+            <w:pPr>
+              <w:pStyle w:val="CSIRText"/>
+            </w:pPr>
+            <w:r>
+              <w:t xml:space="preserve">5.944</w:t>
+            </w:r>
+          </w:p>
+        </w:tc>
+        <w:tc>
+          <w:tcPr/>
+          <w:p>
+            <w:pPr>
+              <w:pStyle w:val="CSIRText"/>
+            </w:pPr>
+            <w:r>
+              <w:t xml:space="preserve">0.699</w:t>
             </w:r>
           </w:p>
         </w:tc>
@@ -9230,6 +9829,401 @@
               <w:pStyle w:val="CSIRText"/>
             </w:pPr>
             <w:r>
+              <w:t xml:space="preserve">R2_M1</w:t>
+            </w:r>
+          </w:p>
+        </w:tc>
+        <w:tc>
+          <w:tcPr/>
+          <w:p>
+            <w:pPr>
+              <w:pStyle w:val="CSIRText"/>
+            </w:pPr>
+            <w:r>
+              <w:t xml:space="preserve">413,919</w:t>
+            </w:r>
+          </w:p>
+        </w:tc>
+        <w:tc>
+          <w:tcPr/>
+          <w:p>
+            <w:pPr>
+              <w:pStyle w:val="CSIRText"/>
+            </w:pPr>
+            <w:r>
+              <w:t xml:space="preserve">322,179</w:t>
+            </w:r>
+          </w:p>
+        </w:tc>
+        <w:tc>
+          <w:tcPr/>
+          <w:p>
+            <w:pPr>
+              <w:pStyle w:val="CSIRText"/>
+            </w:pPr>
+            <w:r>
+              <w:t xml:space="preserve">6.823</w:t>
+            </w:r>
+          </w:p>
+        </w:tc>
+        <w:tc>
+          <w:tcPr/>
+          <w:p>
+            <w:pPr>
+              <w:pStyle w:val="CSIRText"/>
+            </w:pPr>
+            <w:r>
+              <w:t xml:space="preserve">0.914</w:t>
+            </w:r>
+          </w:p>
+        </w:tc>
+        <w:tc>
+          <w:tcPr/>
+          <w:p>
+            <w:pPr>
+              <w:pStyle w:val="CSIRText"/>
+            </w:pPr>
+            <w:r>
+              <w:t xml:space="preserve">true</w:t>
+            </w:r>
+          </w:p>
+        </w:tc>
+        <w:tc>
+          <w:tcPr/>
+          <w:p>
+            <w:pPr>
+              <w:pStyle w:val="CSIRText"/>
+            </w:pPr>
+            <w:r>
+              <w:t xml:space="preserve">true</w:t>
+            </w:r>
+          </w:p>
+        </w:tc>
+      </w:tr>
+      <w:tr>
+        <w:tc>
+          <w:tcPr/>
+          <w:p>
+            <w:pPr>
+              <w:pStyle w:val="CSIRText"/>
+            </w:pPr>
+            <w:r>
+              <w:t xml:space="preserve">R2_M2</w:t>
+            </w:r>
+          </w:p>
+        </w:tc>
+        <w:tc>
+          <w:tcPr/>
+          <w:p>
+            <w:pPr>
+              <w:pStyle w:val="CSIRText"/>
+            </w:pPr>
+            <w:r>
+              <w:t xml:space="preserve">413,919</w:t>
+            </w:r>
+          </w:p>
+        </w:tc>
+        <w:tc>
+          <w:tcPr/>
+          <w:p>
+            <w:pPr>
+              <w:pStyle w:val="CSIRText"/>
+            </w:pPr>
+            <w:r>
+              <w:t xml:space="preserve">322,179</w:t>
+            </w:r>
+          </w:p>
+        </w:tc>
+        <w:tc>
+          <w:tcPr/>
+          <w:p>
+            <w:pPr>
+              <w:pStyle w:val="CSIRText"/>
+            </w:pPr>
+            <w:r>
+              <w:t xml:space="preserve">7.047</w:t>
+            </w:r>
+          </w:p>
+        </w:tc>
+        <w:tc>
+          <w:tcPr/>
+          <w:p>
+            <w:pPr>
+              <w:pStyle w:val="CSIRText"/>
+            </w:pPr>
+            <w:r>
+              <w:t xml:space="preserve">0.903</w:t>
+            </w:r>
+          </w:p>
+        </w:tc>
+        <w:tc>
+          <w:tcPr/>
+          <w:p>
+            <w:pPr>
+              <w:pStyle w:val="CSIRText"/>
+            </w:pPr>
+            <w:r>
+              <w:t xml:space="preserve">true</w:t>
+            </w:r>
+          </w:p>
+        </w:tc>
+        <w:tc>
+          <w:tcPr/>
+          <w:p>
+            <w:pPr>
+              <w:pStyle w:val="CSIRText"/>
+            </w:pPr>
+            <w:r>
+              <w:t xml:space="preserve">true</w:t>
+            </w:r>
+          </w:p>
+        </w:tc>
+      </w:tr>
+      <w:tr>
+        <w:tc>
+          <w:tcPr/>
+          <w:p>
+            <w:pPr>
+              <w:pStyle w:val="CSIRText"/>
+            </w:pPr>
+            <w:r>
+              <w:t xml:space="preserve">R3_M1</w:t>
+            </w:r>
+          </w:p>
+        </w:tc>
+        <w:tc>
+          <w:tcPr/>
+          <w:p>
+            <w:pPr>
+              <w:pStyle w:val="CSIRText"/>
+            </w:pPr>
+            <w:r>
+              <w:t xml:space="preserve">583,830</w:t>
+            </w:r>
+          </w:p>
+        </w:tc>
+        <w:tc>
+          <w:tcPr/>
+          <w:p>
+            <w:pPr>
+              <w:pStyle w:val="CSIRText"/>
+            </w:pPr>
+            <w:r>
+              <w:t xml:space="preserve">469,330</w:t>
+            </w:r>
+          </w:p>
+        </w:tc>
+        <w:tc>
+          <w:tcPr/>
+          <w:p>
+            <w:pPr>
+              <w:pStyle w:val="CSIRText"/>
+            </w:pPr>
+            <w:r>
+              <w:t xml:space="preserve">0.951</w:t>
+            </w:r>
+          </w:p>
+        </w:tc>
+        <w:tc>
+          <w:tcPr/>
+          <w:p>
+            <w:pPr>
+              <w:pStyle w:val="CSIRText"/>
+            </w:pPr>
+            <w:r>
+              <w:t xml:space="preserve">1.027</w:t>
+            </w:r>
+          </w:p>
+        </w:tc>
+        <w:tc>
+          <w:tcPr/>
+          <w:p>
+            <w:pPr>
+              <w:pStyle w:val="CSIRText"/>
+            </w:pPr>
+            <w:r>
+              <w:t xml:space="preserve">true</w:t>
+            </w:r>
+          </w:p>
+        </w:tc>
+        <w:tc>
+          <w:tcPr/>
+          <w:p>
+            <w:pPr>
+              <w:pStyle w:val="CSIRText"/>
+            </w:pPr>
+            <w:r>
+              <w:t xml:space="preserve">true</w:t>
+            </w:r>
+          </w:p>
+        </w:tc>
+      </w:tr>
+      <w:tr>
+        <w:tc>
+          <w:tcPr/>
+          <w:p>
+            <w:pPr>
+              <w:pStyle w:val="CSIRText"/>
+            </w:pPr>
+            <w:r>
+              <w:t xml:space="preserve">R3_M2</w:t>
+            </w:r>
+          </w:p>
+        </w:tc>
+        <w:tc>
+          <w:tcPr/>
+          <w:p>
+            <w:pPr>
+              <w:pStyle w:val="CSIRText"/>
+            </w:pPr>
+            <w:r>
+              <w:t xml:space="preserve">583,830</w:t>
+            </w:r>
+          </w:p>
+        </w:tc>
+        <w:tc>
+          <w:tcPr/>
+          <w:p>
+            <w:pPr>
+              <w:pStyle w:val="CSIRText"/>
+            </w:pPr>
+            <w:r>
+              <w:t xml:space="preserve">469,330</w:t>
+            </w:r>
+          </w:p>
+        </w:tc>
+        <w:tc>
+          <w:tcPr/>
+          <w:p>
+            <w:pPr>
+              <w:pStyle w:val="CSIRText"/>
+            </w:pPr>
+            <w:r>
+              <w:t xml:space="preserve">0.975</w:t>
+            </w:r>
+          </w:p>
+        </w:tc>
+        <w:tc>
+          <w:tcPr/>
+          <w:p>
+            <w:pPr>
+              <w:pStyle w:val="CSIRText"/>
+            </w:pPr>
+            <w:r>
+              <w:t xml:space="preserve">1.023</w:t>
+            </w:r>
+          </w:p>
+        </w:tc>
+        <w:tc>
+          <w:tcPr/>
+          <w:p>
+            <w:pPr>
+              <w:pStyle w:val="CSIRText"/>
+            </w:pPr>
+            <w:r>
+              <w:t xml:space="preserve">true</w:t>
+            </w:r>
+          </w:p>
+        </w:tc>
+        <w:tc>
+          <w:tcPr/>
+          <w:p>
+            <w:pPr>
+              <w:pStyle w:val="CSIRText"/>
+            </w:pPr>
+            <w:r>
+              <w:t xml:space="preserve">true</w:t>
+            </w:r>
+          </w:p>
+        </w:tc>
+      </w:tr>
+      <w:tr>
+        <w:tc>
+          <w:tcPr/>
+          <w:p>
+            <w:pPr>
+              <w:pStyle w:val="CSIRText"/>
+            </w:pPr>
+            <w:r>
+              <w:t xml:space="preserve">R4_M1</w:t>
+            </w:r>
+          </w:p>
+        </w:tc>
+        <w:tc>
+          <w:tcPr/>
+          <w:p>
+            <w:pPr>
+              <w:pStyle w:val="CSIRText"/>
+            </w:pPr>
+            <w:r>
+              <w:t xml:space="preserve">164,772</w:t>
+            </w:r>
+          </w:p>
+        </w:tc>
+        <w:tc>
+          <w:tcPr/>
+          <w:p>
+            <w:pPr>
+              <w:pStyle w:val="CSIRText"/>
+            </w:pPr>
+            <w:r>
+              <w:t xml:space="preserve">50,272</w:t>
+            </w:r>
+          </w:p>
+        </w:tc>
+        <w:tc>
+          <w:tcPr/>
+          <w:p>
+            <w:pPr>
+              <w:pStyle w:val="CSIRText"/>
+            </w:pPr>
+            <w:r>
+              <w:t xml:space="preserve">6.513</w:t>
+            </w:r>
+          </w:p>
+        </w:tc>
+        <w:tc>
+          <w:tcPr/>
+          <w:p>
+            <w:pPr>
+              <w:pStyle w:val="CSIRText"/>
+            </w:pPr>
+            <w:r>
+              <w:t xml:space="preserve">1.015</w:t>
+            </w:r>
+          </w:p>
+        </w:tc>
+        <w:tc>
+          <w:tcPr/>
+          <w:p>
+            <w:pPr>
+              <w:pStyle w:val="CSIRText"/>
+            </w:pPr>
+            <w:r>
+              <w:t xml:space="preserve">true</w:t>
+            </w:r>
+          </w:p>
+        </w:tc>
+        <w:tc>
+          <w:tcPr/>
+          <w:p>
+            <w:pPr>
+              <w:pStyle w:val="CSIRText"/>
+            </w:pPr>
+            <w:r>
+              <w:t xml:space="preserve">true</w:t>
+            </w:r>
+          </w:p>
+        </w:tc>
+      </w:tr>
+      <w:tr>
+        <w:tc>
+          <w:tcPr/>
+          <w:p>
+            <w:pPr>
+              <w:pStyle w:val="CSIRText"/>
+            </w:pPr>
+            <w:r>
               <w:t xml:space="preserve">R4_M2</w:t>
             </w:r>
           </w:p>
@@ -9275,6 +10269,243 @@
             </w:pPr>
             <w:r>
               <w:t xml:space="preserve">1.014</w:t>
+            </w:r>
+          </w:p>
+        </w:tc>
+        <w:tc>
+          <w:tcPr/>
+          <w:p>
+            <w:pPr>
+              <w:pStyle w:val="CSIRText"/>
+            </w:pPr>
+            <w:r>
+              <w:t xml:space="preserve">true</w:t>
+            </w:r>
+          </w:p>
+        </w:tc>
+        <w:tc>
+          <w:tcPr/>
+          <w:p>
+            <w:pPr>
+              <w:pStyle w:val="CSIRText"/>
+            </w:pPr>
+            <w:r>
+              <w:t xml:space="preserve">true</w:t>
+            </w:r>
+          </w:p>
+        </w:tc>
+      </w:tr>
+      <w:tr>
+        <w:tc>
+          <w:tcPr/>
+          <w:p>
+            <w:pPr>
+              <w:pStyle w:val="CSIRText"/>
+            </w:pPr>
+            <w:r>
+              <w:t xml:space="preserve">R5_M2W</w:t>
+            </w:r>
+          </w:p>
+        </w:tc>
+        <w:tc>
+          <w:tcPr/>
+          <w:p>
+            <w:pPr>
+              <w:pStyle w:val="CSIRText"/>
+            </w:pPr>
+            <w:r>
+              <w:t xml:space="preserve">583,830</w:t>
+            </w:r>
+          </w:p>
+        </w:tc>
+        <w:tc>
+          <w:tcPr/>
+          <w:p>
+            <w:pPr>
+              <w:pStyle w:val="CSIRText"/>
+            </w:pPr>
+            <w:r>
+              <w:t xml:space="preserve">469,330</w:t>
+            </w:r>
+          </w:p>
+        </w:tc>
+        <w:tc>
+          <w:tcPr/>
+          <w:p>
+            <w:pPr>
+              <w:pStyle w:val="CSIRText"/>
+            </w:pPr>
+            <w:r>
+              <w:t xml:space="preserve">6.399</w:t>
+            </w:r>
+          </w:p>
+        </w:tc>
+        <w:tc>
+          <w:tcPr/>
+          <w:p>
+            <w:pPr>
+              <w:pStyle w:val="CSIRText"/>
+            </w:pPr>
+            <w:r>
+              <w:t xml:space="preserve">0.902</w:t>
+            </w:r>
+          </w:p>
+        </w:tc>
+        <w:tc>
+          <w:tcPr/>
+          <w:p>
+            <w:pPr>
+              <w:pStyle w:val="CSIRText"/>
+            </w:pPr>
+            <w:r>
+              <w:t xml:space="preserve">true</w:t>
+            </w:r>
+          </w:p>
+        </w:tc>
+        <w:tc>
+          <w:tcPr/>
+          <w:p>
+            <w:pPr>
+              <w:pStyle w:val="CSIRText"/>
+            </w:pPr>
+            <w:r>
+              <w:t xml:space="preserve">true</w:t>
+            </w:r>
+          </w:p>
+        </w:tc>
+      </w:tr>
+      <w:tr>
+        <w:tc>
+          <w:tcPr/>
+          <w:p>
+            <w:pPr>
+              <w:pStyle w:val="CSIRText"/>
+            </w:pPr>
+            <w:r>
+              <w:t xml:space="preserve">R6_M1</w:t>
+            </w:r>
+          </w:p>
+        </w:tc>
+        <w:tc>
+          <w:tcPr/>
+          <w:p>
+            <w:pPr>
+              <w:pStyle w:val="CSIRText"/>
+            </w:pPr>
+            <w:r>
+              <w:t xml:space="preserve">582,627</w:t>
+            </w:r>
+          </w:p>
+        </w:tc>
+        <w:tc>
+          <w:tcPr/>
+          <w:p>
+            <w:pPr>
+              <w:pStyle w:val="CSIRText"/>
+            </w:pPr>
+            <w:r>
+              <w:t xml:space="preserve">468,305</w:t>
+            </w:r>
+          </w:p>
+        </w:tc>
+        <w:tc>
+          <w:tcPr/>
+          <w:p>
+            <w:pPr>
+              <w:pStyle w:val="CSIRText"/>
+            </w:pPr>
+            <w:r>
+              <w:t xml:space="preserve">6.135</w:t>
+            </w:r>
+          </w:p>
+        </w:tc>
+        <w:tc>
+          <w:tcPr/>
+          <w:p>
+            <w:pPr>
+              <w:pStyle w:val="CSIRText"/>
+            </w:pPr>
+            <w:r>
+              <w:t xml:space="preserve">0.904</w:t>
+            </w:r>
+          </w:p>
+        </w:tc>
+        <w:tc>
+          <w:tcPr/>
+          <w:p>
+            <w:pPr>
+              <w:pStyle w:val="CSIRText"/>
+            </w:pPr>
+            <w:r>
+              <w:t xml:space="preserve">true</w:t>
+            </w:r>
+          </w:p>
+        </w:tc>
+        <w:tc>
+          <w:tcPr/>
+          <w:p>
+            <w:pPr>
+              <w:pStyle w:val="CSIRText"/>
+            </w:pPr>
+            <w:r>
+              <w:t xml:space="preserve">true</w:t>
+            </w:r>
+          </w:p>
+        </w:tc>
+      </w:tr>
+      <w:tr>
+        <w:tc>
+          <w:tcPr/>
+          <w:p>
+            <w:pPr>
+              <w:pStyle w:val="CSIRText"/>
+            </w:pPr>
+            <w:r>
+              <w:t xml:space="preserve">R6_M2</w:t>
+            </w:r>
+          </w:p>
+        </w:tc>
+        <w:tc>
+          <w:tcPr/>
+          <w:p>
+            <w:pPr>
+              <w:pStyle w:val="CSIRText"/>
+            </w:pPr>
+            <w:r>
+              <w:t xml:space="preserve">582,627</w:t>
+            </w:r>
+          </w:p>
+        </w:tc>
+        <w:tc>
+          <w:tcPr/>
+          <w:p>
+            <w:pPr>
+              <w:pStyle w:val="CSIRText"/>
+            </w:pPr>
+            <w:r>
+              <w:t xml:space="preserve">468,305</w:t>
+            </w:r>
+          </w:p>
+        </w:tc>
+        <w:tc>
+          <w:tcPr/>
+          <w:p>
+            <w:pPr>
+              <w:pStyle w:val="CSIRText"/>
+            </w:pPr>
+            <w:r>
+              <w:t xml:space="preserve">6.253</w:t>
+            </w:r>
+          </w:p>
+        </w:tc>
+        <w:tc>
+          <w:tcPr/>
+          <w:p>
+            <w:pPr>
+              <w:pStyle w:val="CSIRText"/>
+            </w:pPr>
+            <w:r>
+              <w:t xml:space="preserve">0.890</w:t>
             </w:r>
           </w:p>
         </w:tc>

</xml_diff>

<commit_message>
paper_v2: within-account person association in robustness, abstract, conclusion; M2 elasticity
Co-Authored-By: Claude Opus 5.5 <noreply@anthropic.com>
</commit_message>
<xml_diff>
--- a/paper/paper_v2.docx
+++ b/paper/paper_v2.docx
@@ -58,7 +58,7 @@
         <w:t xml:space="preserve"> </w:t>
       </w:r>
       <w:r>
-        <w:t xml:space="preserve">Do visual properties of a photograph predict how many likes it earns once audience size is taken into account? We analysed 583,830 Instagram photographs from 469,330 public accounts with a pre-registered negative binomial mixed model. The model has an account random intercept and uses the log of the recorded follower count as an offset. A finding counted only if it passed Holm-corrected significance, exceeded a ±3% smallest effect size of interest (with equivalence tests for null claims), and replicated in two disjoint halves of accounts. Higher overall aesthetic quality (+5.7% likes per follower per SD; IRR 1.057, 95% CI [1.055, 1.059]) and the presence of a detected person (IRR 1.239, [1.230, 1.249]) were supported. The aesthetic association held within accounts (IRR 1.042 [1.039, 1.045]), and its between-account component differed only negligibly. Colour vividness, often recommended to creators, had a practically negligible association (IRR 0.977, [0.974, 0.980]). On 94,172 held-out accounts, visual features improved the joint log predictive score by 0.0160 nats per post (95% CI [0.0148, 0.0170]). A freely estimated follower elasticity of 0.629 shows that likes grow sublinearly with audience size. The study demonstrates an auditable CRISP-DM workflow for large-sample social-media inference.</w:t>
+        <w:t xml:space="preserve">Do visual properties of a photograph predict how many likes it earns once audience size is taken into account? We analysed 583,830 Instagram photographs from 469,330 public accounts with a pre-registered negative binomial mixed model. The model has an account random intercept and uses the log of the recorded follower count as an offset. A finding counted only if it passed Holm-corrected significance, exceeded a ±3% smallest effect size of interest (with equivalence tests for null claims), and replicated in two disjoint halves of accounts. Higher overall aesthetic quality (+5.7% likes per follower per SD; IRR 1.057, 95% CI [1.055, 1.059]) and the presence of a detected person (IRR 1.239, [1.230, 1.249]; about +14% within accounts) were supported. The aesthetic association held within accounts (IRR 1.042 [1.039, 1.045]), and its between-account component differed only negligibly. Colour vividness, often recommended to creators, had a practically negligible association (IRR 0.977, [0.974, 0.980]). On 94,172 held-out accounts, visual features improved the joint log predictive score by 0.0160 nats per post (95% CI [0.0148, 0.0170]). A freely estimated follower elasticity of 0.629 shows that likes grow sublinearly with audience size. The study demonstrates an auditable CRISP-DM workflow for large-sample social-media inference.</w:t>
       </w:r>
     </w:p>
     <w:p>
@@ -7096,13 +7096,13 @@
         <w:t xml:space="preserve"> </w:t>
       </w:r>
       <w:r>
-        <w:t xml:space="preserve">Freeing the follower coefficient (R1) gives an elasticity of 0.629 [0.628, 0.631], well below</w:t>
-      </w:r>
-      <w:r>
-        <w:t xml:space="preserve"> </w:t>
-      </w:r>
-      <w:r>
-        <w:t xml:space="preserve">the value of 1 imposed by the offset. Likes grow less than proportionally with recorded</w:t>
+        <w:t xml:space="preserve">Freeing the follower coefficient (R1) gives an elasticity of 0.629 [0.628, 0.631] (0.608</w:t>
+      </w:r>
+      <w:r>
+        <w:t xml:space="preserve"> </w:t>
+      </w:r>
+      <w:r>
+        <w:t xml:space="preserve">[0.606, 0.610] in the M2 specification), well below the value of 1 imposed by the offset. Likes grow less than proportionally with recorded</w:t>
       </w:r>
       <w:r>
         <w:t xml:space="preserve"> </w:t>
@@ -7132,7 +7132,37 @@
         <w:t xml:space="preserve"> </w:t>
       </w:r>
       <w:r>
-        <w:t xml:space="preserve">1.137 [1.126, 1.149], vivid colour 0.988 [0.984, 0.992]. Restricting to 2019 posts (R2) gives aesthetic 1.050 [1.047, 1.052] and person 1.205 [1.195, 1.216]. Removing extreme observations (R6) gives aesthetic 1.057 [1.055, 1.060] and person 1.240 [1.231, 1.250]. With comments as the outcome (R3) gives aesthetic 1.042 [1.038, 1.047] and person 1.533 [1.507, 1.559]. In the full Mundlak model (R5), the within-account associations are person 1.144 [1.132, 1.156] and vivid colour 0.990 [0.986, 0.994].</w:t>
+        <w:t xml:space="preserve">1.137 [1.126, 1.149], vivid colour 0.988 [0.984, 0.992]. Restricting to 2019 posts (R2) gives aesthetic 1.050 [1.047, 1.052] and person 1.205 [1.195, 1.216]. Removing extreme observations (R6) gives aesthetic 1.057 [1.055, 1.060] and person 1.240 [1.231, 1.250]. Using comments as the outcome (R3) gives aesthetic 1.042 [1.038, 1.047] and person 1.533 [1.507, 1.559]. In the full Mundlak model (R5), the within-account associations are person 1.144 [1.132, 1.156] and vivid colour 0.990 [0.986, 0.994]. In every specification the</w:t>
+      </w:r>
+      <w:r>
+        <w:t xml:space="preserve"> </w:t>
+      </w:r>
+      <w:r>
+        <w:t xml:space="preserve">aesthetic and person intervals lie above the SESOI band, and the vivid-colour estimate stays</w:t>
+      </w:r>
+      <w:r>
+        <w:t xml:space="preserve"> </w:t>
+      </w:r>
+      <w:r>
+        <w:t xml:space="preserve">close to one. The person association is smaller when it is identified within accounts (R4 and</w:t>
+      </w:r>
+      <w:r>
+        <w:t xml:space="preserve"> </w:t>
+      </w:r>
+      <w:r>
+        <w:t xml:space="preserve">R5, about +14%). Part of the pooled association therefore reflects differences between accounts</w:t>
+      </w:r>
+      <w:r>
+        <w:t xml:space="preserve"> </w:t>
+      </w:r>
+      <w:r>
+        <w:t xml:space="preserve">that post more photographs of people, but the within-account association still clearly exceeds</w:t>
+      </w:r>
+      <w:r>
+        <w:t xml:space="preserve"> </w:t>
+      </w:r>
+      <w:r>
+        <w:t xml:space="preserve">the threshold.</w:t>
       </w:r>
     </w:p>
     <w:p>
@@ -8197,7 +8227,7 @@
         <w:pStyle w:val="CSIRText"/>
       </w:pPr>
       <w:r>
-        <w:t xml:space="preserve">All 22 fitted models converged with positive-definite Hessians; M1 reported a false-convergence warning from nlminb; re-optimisation from its own estimates with an independent optimiser (BFGS) converged to the same optimum (identical log-likelihood and coefficients; D20). The NB2 dispersion and the account SD are similar across models</w:t>
+        <w:t xml:space="preserve">All 22 fitted models converged with positive-definite Hessians. M1 reported a false-convergence warning from nlminb; re-optimisation from its own estimates with an independent optimiser (BFGS) converged to the same optimum (identical log-likelihood and coefficients; D20). The NB2 dispersion and the account SD are similar across models</w:t>
       </w:r>
       <w:r>
         <w:t xml:space="preserve"> </w:t>
@@ -10616,7 +10646,13 @@
         <w:t xml:space="preserve"> </w:t>
       </w:r>
       <w:r>
-        <w:t xml:space="preserve">attribute. In the M2 model, no individual attribute exceeds +4% per SD.</w:t>
+        <w:t xml:space="preserve">attribute. Identified within accounts, the person association is smaller (about +14%; R4 and R5)</w:t>
+      </w:r>
+      <w:r>
+        <w:t xml:space="preserve"> </w:t>
+      </w:r>
+      <w:r>
+        <w:t xml:space="preserve">but still well above the practical threshold. In the M2 model, no individual attribute exceeds +4% per SD.</w:t>
       </w:r>
     </w:p>
     <w:p>
@@ -11197,7 +11233,7 @@
         <w:t xml:space="preserve"> </w:t>
       </w:r>
       <w:r>
-        <w:t xml:space="preserve">a person (about +22%). Both pass Holm-corrected significance, a pre-registered ±3% practical</w:t>
+        <w:t xml:space="preserve">a person (about +22% overall and +14% within accounts). Both pass Holm-corrected significance, a pre-registered ±3% practical</w:t>
       </w:r>
       <w:r>
         <w:t xml:space="preserve"> </w:t>

</xml_diff>